<commit_message>
Cover letter: retarget to Journal of Soil and Water Conservation
Replace the stale 'Catena' reference with the Journal of Soil and Water
Conservation, and add an explicit statement that the manuscript is
original and not under consideration elsewhere (per editorial request).

Co-Authored-By: Claude Opus 4.8 <noreply@anthropic.com>
</commit_message>
<xml_diff>
--- a/Berm_outcome_cover_letter.docx
+++ b/Berm_outcome_cover_letter.docx
@@ -74,34 +74,50 @@
       <w:pPr>
         <w:rPr>
           <w:rFonts w:ascii="Calibri" w:eastAsia="Calibri" w:hAnsi="Calibri" w:cs="Calibri"/>
-          <w:sz w:val="21"/>
-          <w:szCs w:val="21"/>
-        </w:rPr>
-      </w:pPr>
-    </w:p>
-    <w:p>
-      <w:pPr>
-        <w:rPr>
-          <w:rFonts w:ascii="Calibri" w:eastAsia="Calibri" w:hAnsi="Calibri" w:cs="Calibri"/>
-          <w:sz w:val="21"/>
-          <w:szCs w:val="21"/>
-        </w:rPr>
-      </w:pPr>
-      <w:r>
-        <w:rPr>
-          <w:rFonts w:ascii="Calibri" w:eastAsia="Calibri" w:hAnsi="Calibri" w:cs="Calibri"/>
-          <w:sz w:val="21"/>
-          <w:szCs w:val="21"/>
-        </w:rPr>
-        <w:t>July 2, 2026</w:t>
-      </w:r>
-    </w:p>
-    <w:p>
-      <w:pPr>
-        <w:rPr>
-          <w:rFonts w:ascii="Calibri" w:eastAsia="Calibri" w:hAnsi="Calibri" w:cs="Calibri"/>
-          <w:sz w:val="21"/>
-          <w:szCs w:val="21"/>
+          <w:sz w:val="16"/>
+          <w:szCs w:val="16"/>
+        </w:rPr>
+      </w:pPr>
+    </w:p>
+    <w:p>
+      <w:pPr>
+        <w:rPr>
+          <w:rFonts w:ascii="Calibri" w:eastAsia="Calibri" w:hAnsi="Calibri" w:cs="Calibri"/>
+          <w:sz w:val="21"/>
+          <w:szCs w:val="21"/>
+        </w:rPr>
+      </w:pPr>
+      <w:r>
+        <w:rPr>
+          <w:rFonts w:ascii="Calibri" w:eastAsia="Calibri" w:hAnsi="Calibri" w:cs="Calibri"/>
+          <w:sz w:val="21"/>
+          <w:szCs w:val="21"/>
+        </w:rPr>
+        <w:t xml:space="preserve">July </w:t>
+      </w:r>
+      <w:r>
+        <w:rPr>
+          <w:rFonts w:ascii="Calibri" w:eastAsia="Calibri" w:hAnsi="Calibri" w:cs="Calibri"/>
+          <w:sz w:val="21"/>
+          <w:szCs w:val="21"/>
+        </w:rPr>
+        <w:t>11</w:t>
+      </w:r>
+      <w:r>
+        <w:rPr>
+          <w:rFonts w:ascii="Calibri" w:eastAsia="Calibri" w:hAnsi="Calibri" w:cs="Calibri"/>
+          <w:sz w:val="21"/>
+          <w:szCs w:val="21"/>
+        </w:rPr>
+        <w:t>, 2026</w:t>
+      </w:r>
+    </w:p>
+    <w:p>
+      <w:pPr>
+        <w:rPr>
+          <w:rFonts w:ascii="Calibri" w:eastAsia="Calibri" w:hAnsi="Calibri" w:cs="Calibri"/>
+          <w:sz w:val="16"/>
+          <w:szCs w:val="16"/>
         </w:rPr>
       </w:pPr>
       <w:r>
@@ -176,7 +192,7 @@
           <w:sz w:val="21"/>
           <w:szCs w:val="21"/>
         </w:rPr>
-        <w:t>Catena</w:t>
+        <w:t>the Journal of Soil and Water Conservation</w:t>
       </w:r>
       <w:r>
         <w:rPr>
@@ -248,311 +264,294 @@
           <w:sz w:val="21"/>
           <w:szCs w:val="21"/>
         </w:rPr>
-        <w:t xml:space="preserve"> (</w:t>
-      </w:r>
-      <w:r>
-        <w:rPr>
-          <w:rFonts w:ascii="Calibri" w:eastAsia="Calibri" w:hAnsi="Calibri" w:cs="Calibri"/>
-          <w:color w:val="222222"/>
-          <w:sz w:val="21"/>
-          <w:szCs w:val="21"/>
-        </w:rPr>
-        <w:t>intact</w:t>
-      </w:r>
-      <w:r>
-        <w:rPr>
-          <w:rFonts w:ascii="Calibri" w:eastAsia="Calibri" w:hAnsi="Calibri" w:cs="Calibri"/>
-          <w:color w:val="222222"/>
+        <w:t xml:space="preserve"> (intact </w:t>
+      </w:r>
+      <w:r>
+        <w:rPr>
+          <w:rFonts w:ascii="Calibri" w:eastAsia="Calibri" w:hAnsi="Calibri" w:cs="Calibri"/>
+          <w:color w:val="222222"/>
+          <w:sz w:val="21"/>
+          <w:szCs w:val="21"/>
+        </w:rPr>
+        <w:t>vs.</w:t>
+      </w:r>
+      <w:r>
+        <w:rPr>
+          <w:rFonts w:ascii="Calibri" w:eastAsia="Calibri" w:hAnsi="Calibri" w:cs="Calibri"/>
+          <w:color w:val="222222"/>
+          <w:sz w:val="21"/>
+          <w:szCs w:val="21"/>
+        </w:rPr>
+        <w:t xml:space="preserve"> degraded)</w:t>
+      </w:r>
+      <w:r>
+        <w:rPr>
+          <w:rFonts w:ascii="Calibri" w:eastAsia="Calibri" w:hAnsi="Calibri" w:cs="Calibri"/>
+          <w:color w:val="222222"/>
+          <w:sz w:val="21"/>
+          <w:szCs w:val="21"/>
+        </w:rPr>
+        <w:t xml:space="preserve"> and </w:t>
+      </w:r>
+      <w:r>
+        <w:rPr>
+          <w:rFonts w:ascii="Calibri" w:eastAsia="Calibri" w:hAnsi="Calibri" w:cs="Calibri"/>
+          <w:color w:val="222222"/>
+          <w:sz w:val="21"/>
+          <w:szCs w:val="21"/>
+        </w:rPr>
+        <w:t>effects</w:t>
+      </w:r>
+      <w:r>
+        <w:rPr>
+          <w:rFonts w:ascii="Calibri" w:eastAsia="Calibri" w:hAnsi="Calibri" w:cs="Calibri"/>
+          <w:color w:val="222222"/>
+          <w:sz w:val="21"/>
+          <w:szCs w:val="21"/>
+        </w:rPr>
+        <w:t xml:space="preserve"> on surrounding vegetation remain poorly understood.</w:t>
+      </w:r>
+    </w:p>
+    <w:p>
+      <w:pPr>
+        <w:rPr>
+          <w:rFonts w:ascii="Calibri" w:eastAsia="Calibri" w:hAnsi="Calibri" w:cs="Calibri"/>
+          <w:color w:val="222222"/>
+          <w:sz w:val="21"/>
+          <w:szCs w:val="21"/>
+        </w:rPr>
+      </w:pPr>
+    </w:p>
+    <w:p>
+      <w:pPr>
+        <w:rPr>
+          <w:rFonts w:ascii="Calibri" w:eastAsia="Calibri" w:hAnsi="Calibri" w:cs="Calibri"/>
+          <w:color w:val="222222"/>
+          <w:sz w:val="21"/>
+          <w:szCs w:val="21"/>
+        </w:rPr>
+      </w:pPr>
+      <w:r>
+        <w:rPr>
+          <w:rFonts w:ascii="Calibri" w:eastAsia="Calibri" w:hAnsi="Calibri" w:cs="Calibri"/>
+          <w:color w:val="222222"/>
+          <w:sz w:val="21"/>
+          <w:szCs w:val="21"/>
+        </w:rPr>
+        <w:t>To address this gap, we analyzed 775 water spreader berms in the Altar Valley, southern Arizona, combining remote sensing and soil survey data to determine how soil properties, flow accumulation, berm length, and slope influence structural condition and vegetation response, the latter quantified using the Soil Adjusted Vegetation Index (SAVI). Using controlled logistic regression and a Random Forest classifier, we found that berm length, flow accumulation, and soil texture are the strongest predictors of structural condition, while slope and soil texture are the strongest predictors of vegetation response.</w:t>
+      </w:r>
+      <w:r>
+        <w:rPr>
+          <w:rFonts w:ascii="Calibri" w:eastAsia="Calibri" w:hAnsi="Calibri" w:cs="Calibri"/>
+          <w:color w:val="222222"/>
+          <w:sz w:val="21"/>
+          <w:szCs w:val="21"/>
+        </w:rPr>
+        <w:t xml:space="preserve"> Nearly half of berms (47%) exceed the 7% SAVI-difference threshold used to identify a measurable vegetation response, and the two outcomes are statistically independent, indicating that intact berms do not necessarily produce stronger vegetation responses.</w:t>
+      </w:r>
+      <w:r>
+        <w:rPr>
+          <w:rFonts w:ascii="Calibri" w:eastAsia="Calibri" w:hAnsi="Calibri" w:cs="Calibri"/>
+          <w:color w:val="222222"/>
+          <w:sz w:val="21"/>
+          <w:szCs w:val="21"/>
+        </w:rPr>
+        <w:t xml:space="preserve"> Notably, soil texture predicts both outcomes but in </w:t>
+      </w:r>
+      <w:r>
+        <w:rPr>
+          <w:rFonts w:ascii="Calibri" w:eastAsia="Calibri" w:hAnsi="Calibri" w:cs="Calibri"/>
+          <w:color w:val="222222"/>
+          <w:sz w:val="21"/>
+          <w:szCs w:val="21"/>
+        </w:rPr>
+        <w:t>opposite</w:t>
+      </w:r>
+      <w:r>
+        <w:rPr>
+          <w:rFonts w:ascii="Calibri" w:eastAsia="Calibri" w:hAnsi="Calibri" w:cs="Calibri"/>
+          <w:color w:val="222222"/>
+          <w:sz w:val="21"/>
+          <w:szCs w:val="21"/>
+        </w:rPr>
+        <w:t xml:space="preserve"> directions: berms remain intact more often on finer-textured soils, whereas vegetation responses are larger on </w:t>
+      </w:r>
+      <w:proofErr w:type="gramStart"/>
+      <w:r>
+        <w:rPr>
+          <w:rFonts w:ascii="Calibri" w:eastAsia="Calibri" w:hAnsi="Calibri" w:cs="Calibri"/>
+          <w:color w:val="222222"/>
+          <w:sz w:val="21"/>
+          <w:szCs w:val="21"/>
+        </w:rPr>
+        <w:t>coarser</w:t>
+      </w:r>
+      <w:proofErr w:type="gramEnd"/>
+      <w:r>
+        <w:rPr>
+          <w:rFonts w:ascii="Calibri" w:eastAsia="Calibri" w:hAnsi="Calibri" w:cs="Calibri"/>
+          <w:color w:val="222222"/>
+          <w:sz w:val="21"/>
+          <w:szCs w:val="21"/>
+        </w:rPr>
+        <w:t xml:space="preserve">-textured </w:t>
+      </w:r>
+      <w:r>
+        <w:rPr>
+          <w:rFonts w:ascii="Calibri" w:eastAsia="Calibri" w:hAnsi="Calibri" w:cs="Calibri"/>
+          <w:color w:val="222222"/>
+          <w:sz w:val="21"/>
+          <w:szCs w:val="21"/>
+        </w:rPr>
+        <w:t xml:space="preserve">soils </w:t>
+      </w:r>
+      <w:r>
+        <w:rPr>
+          <w:rFonts w:ascii="Calibri" w:eastAsia="Calibri" w:hAnsi="Calibri" w:cs="Calibri"/>
+          <w:color w:val="222222"/>
+          <w:sz w:val="21"/>
+          <w:szCs w:val="21"/>
+        </w:rPr>
+        <w:t xml:space="preserve">(sandy loam). </w:t>
+      </w:r>
+    </w:p>
+    <w:p>
+      <w:pPr>
+        <w:rPr>
+          <w:rFonts w:ascii="Calibri" w:eastAsia="Calibri" w:hAnsi="Calibri" w:cs="Calibri"/>
+          <w:color w:val="222222"/>
+          <w:sz w:val="21"/>
+          <w:szCs w:val="21"/>
+        </w:rPr>
+      </w:pPr>
+    </w:p>
+    <w:p>
+      <w:pPr>
+        <w:rPr>
+          <w:rFonts w:ascii="Calibri" w:eastAsia="Calibri" w:hAnsi="Calibri" w:cs="Calibri"/>
+          <w:color w:val="222222"/>
+          <w:sz w:val="21"/>
+          <w:szCs w:val="21"/>
+        </w:rPr>
+      </w:pPr>
+      <w:r>
+        <w:rPr>
+          <w:rFonts w:ascii="Calibri" w:eastAsia="Calibri" w:hAnsi="Calibri" w:cs="Calibri"/>
+          <w:color w:val="222222"/>
+          <w:sz w:val="21"/>
+          <w:szCs w:val="21"/>
+        </w:rPr>
+        <w:t>These results demonstrate the importance of incorporating site-specific landscape features when planning and managing berms for erosion control and vegetation restoration in semi-arid regions. Because structural condition and vegetation response are governed by different controls and are statistically independent, management strategies should evaluate physical integrity and ecological function separately. We believe this manuscript will contribute significantly to the understanding of dryland landscape management and the role of legacy conservation structures in rangeland ecosystems.</w:t>
+      </w:r>
+    </w:p>
+    <w:p>
+      <w:pPr>
+        <w:shd w:val="clear" w:color="auto" w:fill="FFFFFF"/>
+        <w:rPr>
+          <w:rFonts w:ascii="Calibri" w:eastAsia="Calibri" w:hAnsi="Calibri" w:cs="Calibri"/>
+          <w:color w:val="222222"/>
+          <w:sz w:val="21"/>
+          <w:szCs w:val="21"/>
+        </w:rPr>
+      </w:pPr>
+    </w:p>
+    <w:p>
+      <w:pPr/>
+      <w:r>
+        <w:rPr>
+          <w:rFonts w:ascii="Calibri" w:hAnsi="Calibri"/>
+          <w:sz w:val="21"/>
+        </w:rPr>
+        <w:t>This manuscript is original, has not been published previously, and is not under consideration for publication at any other journal.</w:t>
+      </w:r>
+    </w:p>
+    <w:p>
+      <w:pPr>
+        <w:shd w:val="clear" w:color="auto" w:fill="FFFFFF"/>
+        <w:rPr>
+          <w:rFonts w:ascii="Calibri" w:eastAsia="Calibri" w:hAnsi="Calibri" w:cs="Calibri"/>
+          <w:color w:val="222222"/>
+          <w:sz w:val="21"/>
+          <w:szCs w:val="21"/>
+        </w:rPr>
+      </w:pPr>
+      <w:r>
+        <w:rPr>
+          <w:rFonts w:ascii="Calibri" w:eastAsia="Calibri" w:hAnsi="Calibri" w:cs="Calibri"/>
+          <w:color w:val="222222"/>
+          <w:sz w:val="21"/>
+          <w:szCs w:val="21"/>
+        </w:rPr>
+        <w:t>Thank you for your consideration of our manuscript.</w:t>
+      </w:r>
+    </w:p>
+    <w:p>
+      <w:pPr>
+        <w:rPr>
+          <w:rFonts w:ascii="Calibri" w:eastAsia="Calibri" w:hAnsi="Calibri" w:cs="Calibri"/>
+          <w:sz w:val="21"/>
+          <w:szCs w:val="21"/>
+        </w:rPr>
+      </w:pPr>
+      <w:r>
+        <w:rPr>
+          <w:rFonts w:ascii="Calibri" w:eastAsia="Calibri" w:hAnsi="Calibri" w:cs="Calibri"/>
           <w:sz w:val="21"/>
           <w:szCs w:val="21"/>
         </w:rPr>
         <w:t xml:space="preserve"> </w:t>
       </w:r>
-      <w:r>
-        <w:rPr>
-          <w:rFonts w:ascii="Calibri" w:eastAsia="Calibri" w:hAnsi="Calibri" w:cs="Calibri"/>
-          <w:color w:val="222222"/>
-          <w:sz w:val="21"/>
-          <w:szCs w:val="21"/>
-        </w:rPr>
-        <w:t>vs.</w:t>
-      </w:r>
-      <w:r>
-        <w:rPr>
-          <w:rFonts w:ascii="Calibri" w:eastAsia="Calibri" w:hAnsi="Calibri" w:cs="Calibri"/>
-          <w:color w:val="222222"/>
-          <w:sz w:val="21"/>
-          <w:szCs w:val="21"/>
-        </w:rPr>
-        <w:t xml:space="preserve"> degraded)</w:t>
-      </w:r>
-      <w:r>
-        <w:rPr>
-          <w:rFonts w:ascii="Calibri" w:eastAsia="Calibri" w:hAnsi="Calibri" w:cs="Calibri"/>
-          <w:color w:val="222222"/>
-          <w:sz w:val="21"/>
-          <w:szCs w:val="21"/>
-        </w:rPr>
-        <w:t xml:space="preserve"> and </w:t>
-      </w:r>
-      <w:r>
-        <w:rPr>
-          <w:rFonts w:ascii="Calibri" w:eastAsia="Calibri" w:hAnsi="Calibri" w:cs="Calibri"/>
-          <w:color w:val="222222"/>
-          <w:sz w:val="21"/>
-          <w:szCs w:val="21"/>
-        </w:rPr>
-        <w:t>effects</w:t>
-      </w:r>
-      <w:r>
-        <w:rPr>
-          <w:rFonts w:ascii="Calibri" w:eastAsia="Calibri" w:hAnsi="Calibri" w:cs="Calibri"/>
-          <w:color w:val="222222"/>
-          <w:sz w:val="21"/>
-          <w:szCs w:val="21"/>
-        </w:rPr>
-        <w:t xml:space="preserve"> on surrounding vegetation remain poorly understood.</w:t>
-      </w:r>
-    </w:p>
-    <w:p>
-      <w:pPr>
-        <w:rPr>
-          <w:rFonts w:ascii="Calibri" w:eastAsia="Calibri" w:hAnsi="Calibri" w:cs="Calibri"/>
-          <w:color w:val="222222"/>
-          <w:sz w:val="21"/>
-          <w:szCs w:val="21"/>
-        </w:rPr>
-      </w:pPr>
-    </w:p>
-    <w:p>
-      <w:pPr>
-        <w:rPr>
-          <w:rFonts w:ascii="Calibri" w:eastAsia="Calibri" w:hAnsi="Calibri" w:cs="Calibri"/>
-          <w:color w:val="222222"/>
-          <w:sz w:val="21"/>
-          <w:szCs w:val="21"/>
-        </w:rPr>
-      </w:pPr>
-      <w:r>
-        <w:rPr>
-          <w:rFonts w:ascii="Calibri" w:eastAsia="Calibri" w:hAnsi="Calibri" w:cs="Calibri"/>
-          <w:color w:val="222222"/>
-          <w:sz w:val="21"/>
-          <w:szCs w:val="21"/>
-        </w:rPr>
-        <w:t>To address this gap, we analyzed 775 water spreader berms in the Altar Valley, southern Arizona, combining remote sensing and soil survey data to determine how soil properties, flow accumulation, berm length, and slope influence structural condition and vegetation response, the latter quantified using the Soil Adjusted Vegetation Index (SAVI). Using controlled logistic regression and a Random Forest classifier, we found that berm length, flow accumulation, and soil texture are the strongest predictors of structural condition, while slope and soil texture are the strongest predictors of vegetation response.</w:t>
-      </w:r>
-      <w:r>
-        <w:rPr>
-          <w:rFonts w:ascii="Calibri" w:eastAsia="Calibri" w:hAnsi="Calibri" w:cs="Calibri"/>
-          <w:color w:val="222222"/>
+    </w:p>
+    <w:p>
+      <w:pPr>
+        <w:rPr>
+          <w:rFonts w:ascii="Calibri" w:eastAsia="Calibri" w:hAnsi="Calibri" w:cs="Calibri"/>
+          <w:sz w:val="21"/>
+          <w:szCs w:val="21"/>
+        </w:rPr>
+      </w:pPr>
+      <w:r>
+        <w:rPr>
+          <w:rFonts w:ascii="Calibri" w:eastAsia="Calibri" w:hAnsi="Calibri" w:cs="Calibri"/>
+          <w:sz w:val="21"/>
+          <w:szCs w:val="21"/>
+        </w:rPr>
+        <w:t>Sincerely,</w:t>
+      </w:r>
+    </w:p>
+    <w:p>
+      <w:pPr>
+        <w:rPr>
+          <w:rFonts w:ascii="Calibri" w:eastAsia="Calibri" w:hAnsi="Calibri" w:cs="Calibri"/>
+          <w:sz w:val="21"/>
+          <w:szCs w:val="21"/>
+        </w:rPr>
+      </w:pPr>
+      <w:r>
+        <w:rPr>
+          <w:rFonts w:ascii="Calibri" w:eastAsia="Calibri" w:hAnsi="Calibri" w:cs="Calibri"/>
+          <w:sz w:val="21"/>
+          <w:szCs w:val="21"/>
+        </w:rPr>
+        <w:t>Octavia Crompton</w:t>
+      </w:r>
+    </w:p>
+    <w:p>
+      <w:pPr>
+        <w:rPr>
+          <w:rFonts w:ascii="Calibri" w:eastAsia="Calibri" w:hAnsi="Calibri" w:cs="Calibri"/>
+          <w:sz w:val="21"/>
+          <w:szCs w:val="21"/>
+        </w:rPr>
+      </w:pPr>
+      <w:r>
+        <w:rPr>
+          <w:rFonts w:ascii="Calibri" w:eastAsia="Calibri" w:hAnsi="Calibri" w:cs="Calibri"/>
           <w:sz w:val="21"/>
           <w:szCs w:val="21"/>
         </w:rPr>
         <w:t xml:space="preserve"> </w:t>
       </w:r>
-      <w:r>
-        <w:rPr>
-          <w:rFonts w:ascii="Calibri" w:eastAsia="Calibri" w:hAnsi="Calibri" w:cs="Calibri"/>
-          <w:color w:val="222222"/>
-          <w:sz w:val="21"/>
-          <w:szCs w:val="21"/>
-        </w:rPr>
-        <w:t>Nearly half of berms (47%) exceed the 7% SAVI-difference threshold used to identify a measurable vegetation response, and the two outcomes are statistically independent, indicating that intact berms do not necessarily produce stronger vegetation responses.</w:t>
-      </w:r>
-      <w:r>
-        <w:rPr>
-          <w:rFonts w:ascii="Calibri" w:eastAsia="Calibri" w:hAnsi="Calibri" w:cs="Calibri"/>
-          <w:color w:val="222222"/>
-          <w:sz w:val="21"/>
-          <w:szCs w:val="21"/>
-        </w:rPr>
-        <w:t xml:space="preserve"> Notably, soil texture predicts both outcomes but in </w:t>
-      </w:r>
-      <w:r>
-        <w:rPr>
-          <w:rFonts w:ascii="Calibri" w:eastAsia="Calibri" w:hAnsi="Calibri" w:cs="Calibri"/>
-          <w:color w:val="222222"/>
-          <w:sz w:val="21"/>
-          <w:szCs w:val="21"/>
-        </w:rPr>
-        <w:t>opposite</w:t>
-      </w:r>
-      <w:r>
-        <w:rPr>
-          <w:rFonts w:ascii="Calibri" w:eastAsia="Calibri" w:hAnsi="Calibri" w:cs="Calibri"/>
-          <w:color w:val="222222"/>
-          <w:sz w:val="21"/>
-          <w:szCs w:val="21"/>
-        </w:rPr>
-        <w:t xml:space="preserve"> directions: berms remain intact more often on finer-textured soils, whereas vegetation responses are larger on </w:t>
-      </w:r>
-      <w:proofErr w:type="gramStart"/>
-      <w:r>
-        <w:rPr>
-          <w:rFonts w:ascii="Calibri" w:eastAsia="Calibri" w:hAnsi="Calibri" w:cs="Calibri"/>
-          <w:color w:val="222222"/>
-          <w:sz w:val="21"/>
-          <w:szCs w:val="21"/>
-        </w:rPr>
-        <w:t>coarser</w:t>
-      </w:r>
-      <w:proofErr w:type="gramEnd"/>
-      <w:r>
-        <w:rPr>
-          <w:rFonts w:ascii="Calibri" w:eastAsia="Calibri" w:hAnsi="Calibri" w:cs="Calibri"/>
-          <w:color w:val="222222"/>
-          <w:sz w:val="21"/>
-          <w:szCs w:val="21"/>
-        </w:rPr>
-        <w:t xml:space="preserve">-textured </w:t>
-      </w:r>
-      <w:r>
-        <w:rPr>
-          <w:rFonts w:ascii="Calibri" w:eastAsia="Calibri" w:hAnsi="Calibri" w:cs="Calibri"/>
-          <w:color w:val="222222"/>
-          <w:sz w:val="21"/>
-          <w:szCs w:val="21"/>
-        </w:rPr>
-        <w:t xml:space="preserve">soils </w:t>
-      </w:r>
-      <w:r>
-        <w:rPr>
-          <w:rFonts w:ascii="Calibri" w:eastAsia="Calibri" w:hAnsi="Calibri" w:cs="Calibri"/>
-          <w:color w:val="222222"/>
-          <w:sz w:val="21"/>
-          <w:szCs w:val="21"/>
-        </w:rPr>
-        <w:t xml:space="preserve">(sandy loam). </w:t>
-      </w:r>
-    </w:p>
-    <w:p>
-      <w:pPr>
-        <w:rPr>
-          <w:rFonts w:ascii="Calibri" w:eastAsia="Calibri" w:hAnsi="Calibri" w:cs="Calibri"/>
-          <w:color w:val="222222"/>
-          <w:sz w:val="21"/>
-          <w:szCs w:val="21"/>
-        </w:rPr>
-      </w:pPr>
-    </w:p>
-    <w:p>
-      <w:pPr>
-        <w:rPr>
-          <w:rFonts w:ascii="Calibri" w:eastAsia="Calibri" w:hAnsi="Calibri" w:cs="Calibri"/>
-          <w:color w:val="222222"/>
-          <w:sz w:val="21"/>
-          <w:szCs w:val="21"/>
-        </w:rPr>
-      </w:pPr>
-      <w:r>
-        <w:rPr>
-          <w:rFonts w:ascii="Calibri" w:eastAsia="Calibri" w:hAnsi="Calibri" w:cs="Calibri"/>
-          <w:color w:val="222222"/>
-          <w:sz w:val="21"/>
-          <w:szCs w:val="21"/>
-        </w:rPr>
-        <w:t>These results demonstrate the importance of incorporating site-specific landscape features when planning and managing berms for erosion control and vegetation restoration in semi-arid regions. Because structural condition and vegetation response are governed by different controls and are statistically independent, management strategies should evaluate physical integrity and ecological function separately. We believe this manuscript will contribute significantly to the understanding of dryland landscape management and the role of legacy conservation structures in rangeland ecosystems.</w:t>
-      </w:r>
-    </w:p>
-    <w:p>
-      <w:pPr>
-        <w:shd w:val="clear" w:color="auto" w:fill="FFFFFF"/>
-        <w:rPr>
-          <w:rFonts w:ascii="Calibri" w:eastAsia="Calibri" w:hAnsi="Calibri" w:cs="Calibri"/>
-          <w:color w:val="222222"/>
-          <w:sz w:val="21"/>
-          <w:szCs w:val="21"/>
-        </w:rPr>
-      </w:pPr>
-    </w:p>
-    <w:p>
-      <w:pPr>
-        <w:shd w:val="clear" w:color="auto" w:fill="FFFFFF"/>
-        <w:rPr>
-          <w:rFonts w:ascii="Calibri" w:eastAsia="Calibri" w:hAnsi="Calibri" w:cs="Calibri"/>
-          <w:color w:val="222222"/>
-          <w:sz w:val="21"/>
-          <w:szCs w:val="21"/>
-        </w:rPr>
-      </w:pPr>
-      <w:r>
-        <w:rPr>
-          <w:rFonts w:ascii="Calibri" w:eastAsia="Calibri" w:hAnsi="Calibri" w:cs="Calibri"/>
-          <w:color w:val="222222"/>
-          <w:sz w:val="21"/>
-          <w:szCs w:val="21"/>
-        </w:rPr>
-        <w:t>Thank you for your consideration of our manuscript.</w:t>
-      </w:r>
-    </w:p>
-    <w:p>
-      <w:pPr>
-        <w:rPr>
-          <w:rFonts w:ascii="Calibri" w:eastAsia="Calibri" w:hAnsi="Calibri" w:cs="Calibri"/>
-          <w:sz w:val="21"/>
-          <w:szCs w:val="21"/>
-        </w:rPr>
-      </w:pPr>
-      <w:r>
-        <w:rPr>
-          <w:rFonts w:ascii="Calibri" w:eastAsia="Calibri" w:hAnsi="Calibri" w:cs="Calibri"/>
-          <w:sz w:val="21"/>
-          <w:szCs w:val="21"/>
-        </w:rPr>
-        <w:t xml:space="preserve"> </w:t>
-      </w:r>
-    </w:p>
-    <w:p>
-      <w:pPr>
-        <w:rPr>
-          <w:rFonts w:ascii="Calibri" w:eastAsia="Calibri" w:hAnsi="Calibri" w:cs="Calibri"/>
-          <w:sz w:val="21"/>
-          <w:szCs w:val="21"/>
-        </w:rPr>
-      </w:pPr>
-      <w:r>
-        <w:rPr>
-          <w:rFonts w:ascii="Calibri" w:eastAsia="Calibri" w:hAnsi="Calibri" w:cs="Calibri"/>
-          <w:sz w:val="21"/>
-          <w:szCs w:val="21"/>
-        </w:rPr>
-        <w:t>Sincerely,</w:t>
-      </w:r>
-    </w:p>
-    <w:p>
-      <w:pPr>
-        <w:rPr>
-          <w:rFonts w:ascii="Calibri" w:eastAsia="Calibri" w:hAnsi="Calibri" w:cs="Calibri"/>
-          <w:sz w:val="21"/>
-          <w:szCs w:val="21"/>
-        </w:rPr>
-      </w:pPr>
-      <w:r>
-        <w:rPr>
-          <w:rFonts w:ascii="Calibri" w:eastAsia="Calibri" w:hAnsi="Calibri" w:cs="Calibri"/>
-          <w:sz w:val="21"/>
-          <w:szCs w:val="21"/>
-        </w:rPr>
-        <w:t>Octavia Crompton</w:t>
-      </w:r>
-    </w:p>
-    <w:p>
-      <w:pPr>
-        <w:rPr>
-          <w:rFonts w:ascii="Calibri" w:eastAsia="Calibri" w:hAnsi="Calibri" w:cs="Calibri"/>
-          <w:sz w:val="21"/>
-          <w:szCs w:val="21"/>
-        </w:rPr>
-      </w:pPr>
-      <w:r>
-        <w:rPr>
-          <w:rFonts w:ascii="Calibri" w:eastAsia="Calibri" w:hAnsi="Calibri" w:cs="Calibri"/>
-          <w:sz w:val="21"/>
-          <w:szCs w:val="21"/>
-        </w:rPr>
-        <w:t xml:space="preserve"> </w:t>
-      </w:r>
     </w:p>
     <w:p>
       <w:pPr>
@@ -640,12 +639,40 @@
           <w:szCs w:val="21"/>
         </w:rPr>
       </w:pPr>
-      <w:r>
-        <w:rPr>
-          <w:rFonts w:ascii="Calibri" w:eastAsia="Calibri" w:hAnsi="Calibri" w:cs="Calibri"/>
-          <w:sz w:val="21"/>
-          <w:szCs w:val="21"/>
-        </w:rPr>
+      <w:proofErr w:type="spellStart"/>
+      <w:r>
+        <w:rPr>
+          <w:rFonts w:ascii="Calibri" w:eastAsia="Calibri" w:hAnsi="Calibri" w:cs="Calibri"/>
+          <w:sz w:val="21"/>
+          <w:szCs w:val="21"/>
+        </w:rPr>
+        <w:t>Menberu</w:t>
+      </w:r>
+      <w:proofErr w:type="spellEnd"/>
+      <w:r>
+        <w:rPr>
+          <w:rFonts w:ascii="Calibri" w:eastAsia="Calibri" w:hAnsi="Calibri" w:cs="Calibri"/>
+          <w:sz w:val="21"/>
+          <w:szCs w:val="21"/>
+        </w:rPr>
+        <w:t xml:space="preserve"> Meles</w:t>
+      </w:r>
+    </w:p>
+    <w:p>
+      <w:pPr>
+        <w:rPr>
+          <w:rFonts w:ascii="Calibri" w:eastAsia="Calibri" w:hAnsi="Calibri" w:cs="Calibri"/>
+          <w:sz w:val="21"/>
+          <w:szCs w:val="21"/>
+        </w:rPr>
+      </w:pPr>
+      <w:r>
+        <w:rPr>
+          <w:rFonts w:ascii="Calibri" w:eastAsia="Calibri" w:hAnsi="Calibri" w:cs="Calibri"/>
+          <w:sz w:val="21"/>
+          <w:szCs w:val="21"/>
+        </w:rPr>
+        <w:lastRenderedPageBreak/>
         <w:t>Mary Nichols</w:t>
       </w:r>
     </w:p>
@@ -663,7 +690,6 @@
           <w:sz w:val="21"/>
           <w:szCs w:val="21"/>
         </w:rPr>
-        <w:lastRenderedPageBreak/>
         <w:t>Highlights</w:t>
       </w:r>
     </w:p>

</xml_diff>